<commit_message>
Fix desktop control contrast
</commit_message>
<xml_diff>
--- a/deliverables/Qlyraxis_Technical_Report.docx
+++ b/deliverables/Qlyraxis_Technical_Report.docx
@@ -1030,7 +1030,7 @@
         <w:drawing>
           <wp:inline xmlns:a="http://schemas.openxmlformats.org/drawingml/2006/main" xmlns:pic="http://schemas.openxmlformats.org/drawingml/2006/picture">
             <wp:extent cx="6126480" cy="2654808"/>
-            <wp:docPr id="1" name="Picture 1" descr="Diagram of the Qlyraxis runtime modules and information boundaries." title="Diagram of the Qlyraxis runtime modules and information boundaries."/>
+            <wp:docPr id="1" name="Picture 1" descr="Figure 1  Runtime modules and information boundaries" title="Figure 1  Runtime modules and information boundaries"/>
             <wp:cNvGraphicFramePr>
               <a:graphicFrameLocks noChangeAspect="1"/>
             </wp:cNvGraphicFramePr>
@@ -2957,34 +2957,34 @@
     </w:p>
     <w:p>
       <w:pPr>
-        <w:pStyle w:val="ListNumber"/>
+        <w:ind w:left="403" w:hanging="317"/>
       </w:pPr>
       <w:r>
-        <w:t>The tracker enters COAST after the first missed measurement and continues with the Kalman prediction.</w:t>
+        <w:t>1.  The tracker enters COAST after the first missed measurement and continues with the Kalman prediction.</w:t>
       </w:r>
     </w:p>
     <w:p>
       <w:pPr>
-        <w:pStyle w:val="ListNumber"/>
+        <w:ind w:left="403" w:hanging="317"/>
       </w:pPr>
       <w:r>
-        <w:t>After the configured coast window it enters REACQUIRE and searches within a local prediction gate.</w:t>
+        <w:t>2.  After the configured coast window it enters REACQUIRE and searches within a local prediction gate.</w:t>
       </w:r>
     </w:p>
     <w:p>
       <w:pPr>
-        <w:pStyle w:val="ListNumber"/>
+        <w:ind w:left="403" w:hanging="317"/>
       </w:pPr>
       <w:r>
-        <w:t>If the local timeout expires the camera resumes a global survey.</w:t>
+        <w:t>3.  If the local timeout expires the camera resumes a global survey.</w:t>
       </w:r>
     </w:p>
     <w:p>
       <w:pPr>
-        <w:pStyle w:val="ListNumber"/>
+        <w:ind w:left="403" w:hanging="317"/>
       </w:pPr>
       <w:r>
-        <w:t>Two consistent measurements restore TRACK and reset the loss counters.</w:t>
+        <w:t>4.  Two consistent measurements restore TRACK and reset the loss counters.</w:t>
       </w:r>
     </w:p>
     <w:p>
@@ -3013,7 +3013,7 @@
         <w:drawing>
           <wp:inline xmlns:a="http://schemas.openxmlformats.org/drawingml/2006/main" xmlns:pic="http://schemas.openxmlformats.org/drawingml/2006/picture">
             <wp:extent cx="5989320" cy="3368992"/>
-            <wp:docPr id="2" name="Picture 2" descr="Screenshot of the Qlyraxis desktop tracking dashboard." title="Screenshot of the Qlyraxis desktop tracking dashboard."/>
+            <wp:docPr id="2" name="Picture 2" descr="Figure 2  Qlyraxis desktop dashboard" title="Figure 2  Qlyraxis desktop dashboard"/>
             <wp:cNvGraphicFramePr>
               <a:graphicFrameLocks noChangeAspect="1"/>
             </wp:cNvGraphicFramePr>
@@ -3854,7 +3854,7 @@
         <w:drawing>
           <wp:inline xmlns:a="http://schemas.openxmlformats.org/drawingml/2006/main" xmlns:pic="http://schemas.openxmlformats.org/drawingml/2006/picture">
             <wp:extent cx="6126480" cy="2859024"/>
-            <wp:docPr id="3" name="Picture 3" descr="Bar chart comparing measured processing throughput across five benchmark scenarios." title="Bar chart comparing measured processing throughput across five benchmark scenarios."/>
+            <wp:docPr id="3" name="Picture 3" descr="Figure 3  Processing throughput across five 60 second runs" title="Figure 3  Processing throughput across five 60 second runs"/>
             <wp:cNvGraphicFramePr>
               <a:graphicFrameLocks noChangeAspect="1"/>
             </wp:cNvGraphicFramePr>

</xml_diff>